<commit_message>
Panel odpowiedzi nad klawiaturą
W trybie edge-to-edge na Androidzie okno nie zmniejsza się po otwarciu
klawiatury, więc w poziomie zasłaniała ona pole odpowiedzi.

- odczyt wysokości klawiatury (useKeyboardHeight)
- przy otwartej klawiaturze panel stoi tuż nad nią, pasek etapu się chowa
- tryb kompaktowy, gdy nad klawiaturą jest mało miejsca
- obliczenia układu w funkcji answerLayout z testami
- dokumentacja: punkt 7.28 i problem 4.16 w raporcie z etapu 2

Co-Authored-By: Claude Opus 5.5 <noreply@anthropic.com>
</commit_message>
<xml_diff>
--- a/docs/Jeden_z_Wielu_Analiza_dynamiczna_etap2.docx
+++ b/docs/Jeden_z_Wielu_Analiza_dynamiczna_etap2.docx
@@ -224,7 +224,7 @@
         <w:spacing w:after="60"/>
       </w:pPr>
       <w:r>
-        <w:t xml:space="preserve">poprawki po pierwszej grze na telefonie: plansza etapu zamykana tylko dotknięciem oraz reguła, że po 4 pytaniach bez gracza bot musi wskazać gracza.</w:t>
+        <w:t xml:space="preserve">poprawki po grach na telefonie: plansza etapu zamykana tylko dotknięciem, reguła, że po 4 pytaniach bez gracza bot musi wskazać gracza, oraz panel odpowiedzi ustawiany nad klawiaturą.</w:t>
       </w:r>
     </w:p>
     <w:p>
@@ -993,7 +993,7 @@
           </w:tcPr>
           <w:p>
             <w:r>
-              <w:t xml:space="preserve">Pierwsza pełna rozgrywka na telefonie; wykryła problemy z punktów 4.14 i 4.15.</w:t>
+              <w:t xml:space="preserve">Rozgrywki na telefonie; wykryły problemy z punktów 4.14, 4.15 i 4.16.</w:t>
             </w:r>
           </w:p>
         </w:tc>
@@ -2430,6 +2430,93 @@
       </w:r>
       <w:r>
         <w:t xml:space="preserve">, która wykonywała ruchy niezgodne z nową regułą, a silnik słusznie je odrzucał. To dobry znak, że reguły nie da się obejść. Funkcję poprawiliśmy, żeby wybierała tylko dozwolone ruchy. Doszły 4 testy w silniku oraz sprawdzenie reguły w 900 symulowanych grach. Przy pomiarze popełniliśmy też błąd: liczyliśmy czekanie gracza również po jego odpadnięciu („najdłuższe czekanie: 90 pytań”). Po poprawce wynik to 5–6 pytań, a czekanie dłuższe niż 4 pytania zdarza się w 0,05–0,4% przypadków (gdy pytanie przechodzi z kolei po złej odpowiedzi).</w:t>
+      </w:r>
+    </w:p>
+    <w:p>
+      <w:pPr>
+        <w:pStyle w:val="Heading2"/>
+      </w:pPr>
+      <w:r>
+        <w:t xml:space="preserve">4.16. Klawiatura zasłaniała pole odpowiedzi</w:t>
+      </w:r>
+    </w:p>
+    <w:p>
+      <w:pPr>
+        <w:spacing w:after="80"/>
+        <w:ind w:left="240"/>
+      </w:pPr>
+      <w:r>
+        <w:rPr>
+          <w:b/>
+          <w:bCs/>
+          <w:color w:val="1F497D"/>
+        </w:rPr>
+        <w:t xml:space="preserve">Problem: </w:t>
+      </w:r>
+      <w:r>
+        <w:t xml:space="preserve">Po otwarciu klawiatury gracz nie widział, co wpisuje. W Expo SDK 57 aplikacja na Androidzie działa w trybie edge-to-edge: okno nie zmniejsza się po otwarciu klawiatury, tylko klawiatura je przykrywa. W poziomie zajmuje ona 60–70% wysokości, a panel odpowiedzi z paskiem etapu był wyższy niż miejsce nad klawiaturą.</w:t>
+      </w:r>
+    </w:p>
+    <w:p>
+      <w:pPr>
+        <w:spacing w:after="80"/>
+        <w:ind w:left="240"/>
+      </w:pPr>
+      <w:r>
+        <w:rPr>
+          <w:b/>
+          <w:bCs/>
+          <w:color w:val="1F497D"/>
+        </w:rPr>
+        <w:t xml:space="preserve">Jak wykryliśmy: </w:t>
+      </w:r>
+      <w:r>
+        <w:t xml:space="preserve">Test ręczny na telefonie. Wcześniejszy zrzut ekranu z przeglądarki (punkt 4.6, rys. 3) nie mógł tego pokazać, bo w przeglądarce nie ma klawiatury ekranowej – to przykład ograniczenia tej techniki.</w:t>
+      </w:r>
+    </w:p>
+    <w:p>
+      <w:pPr>
+        <w:spacing w:after="80"/>
+        <w:ind w:left="240"/>
+      </w:pPr>
+      <w:r>
+        <w:rPr>
+          <w:b/>
+          <w:bCs/>
+          <w:color w:val="1F497D"/>
+        </w:rPr>
+        <w:t xml:space="preserve">Rozwiązanie: </w:t>
+      </w:r>
+      <w:r>
+        <w:t xml:space="preserve">Aplikacja nasłuchuje zdarzeń klawiatury i zna jej wysokość. Przy otwartej klawiaturze panel ustawia się tuż nad nią, pasek etapu się chowa, a gdy miejsca jest mało, panel przechodzi w tryb kompaktowy (bez nagłówka, mniejsze pytanie). Panel pozostaje tym samym elementem, zmienia się tylko styl, więc pole nie traci fokusu ani wpisanego tekstu.</w:t>
+      </w:r>
+    </w:p>
+    <w:p>
+      <w:pPr>
+        <w:spacing w:after="80"/>
+        <w:ind w:left="240"/>
+      </w:pPr>
+      <w:r>
+        <w:rPr>
+          <w:b/>
+          <w:bCs/>
+          <w:color w:val="1F497D"/>
+        </w:rPr>
+        <w:t xml:space="preserve">Zabezpieczenie: </w:t>
+      </w:r>
+      <w:r>
+        <w:t xml:space="preserve">Obliczanie układu wydzieliliśmy do czystej funkcji </w:t>
+      </w:r>
+      <w:r>
+        <w:rPr>
+          <w:rFonts w:ascii="Consolas" w:cs="Consolas" w:eastAsia="Consolas" w:hAnsi="Consolas"/>
+          <w:sz w:val="20"/>
+          <w:szCs w:val="20"/>
+        </w:rPr>
+        <w:t xml:space="preserve">answerLayout</w:t>
+      </w:r>
+      <w:r>
+        <w:t xml:space="preserve"> z 4 testami (bez klawiatury, z klawiaturą, mało miejsca, wycięcie ekranu). Układ sprawdziliśmy na zrzucie z tymczasowej wersji z klawiaturą „udawaną” na stałe (230 dp, ekran 800×360). Ostateczne potwierdzenie wymaga ponownego testu na telefonie.</w:t>
       </w:r>
     </w:p>
     <w:p>
@@ -3103,6 +3190,81 @@
           </w:tcPr>
           <w:p>
             <w:r>
+              <w:t xml:space="preserve">answerLayout-test.ts</w:t>
+            </w:r>
+          </w:p>
+        </w:tc>
+        <w:tc>
+          <w:tcPr>
+            <w:tcW w:type="dxa" w:w="1400"/>
+            <w:tcBorders>
+              <w:top w:val="single" w:color="A6A6A6" w:sz="4"/>
+              <w:left w:val="single" w:color="A6A6A6" w:sz="4"/>
+              <w:bottom w:val="single" w:color="A6A6A6" w:sz="4"/>
+              <w:right w:val="single" w:color="A6A6A6" w:sz="4"/>
+            </w:tcBorders>
+            <w:tcMar>
+              <w:top w:type="dxa" w:w="60"/>
+              <w:left w:type="dxa" w:w="100"/>
+              <w:bottom w:type="dxa" w:w="60"/>
+              <w:right w:type="dxa" w:w="100"/>
+            </w:tcMar>
+          </w:tcPr>
+          <w:p>
+            <w:r>
+              <w:t xml:space="preserve">4</w:t>
+            </w:r>
+          </w:p>
+        </w:tc>
+        <w:tc>
+          <w:tcPr>
+            <w:tcW w:type="dxa" w:w="5160"/>
+            <w:tcBorders>
+              <w:top w:val="single" w:color="A6A6A6" w:sz="4"/>
+              <w:left w:val="single" w:color="A6A6A6" w:sz="4"/>
+              <w:bottom w:val="single" w:color="A6A6A6" w:sz="4"/>
+              <w:right w:val="single" w:color="A6A6A6" w:sz="4"/>
+            </w:tcBorders>
+            <w:tcMar>
+              <w:top w:type="dxa" w:w="60"/>
+              <w:left w:type="dxa" w:w="100"/>
+              <w:bottom w:type="dxa" w:w="60"/>
+              <w:right w:type="dxa" w:w="100"/>
+            </w:tcMar>
+          </w:tcPr>
+          <w:p>
+            <w:r>
+              <w:rPr>
+                <w:b/>
+                <w:bCs/>
+              </w:rPr>
+              <w:t xml:space="preserve">nowe:</w:t>
+            </w:r>
+            <w:r>
+              <w:t xml:space="preserve"> położenie panelu odpowiedzi nad klawiaturą</w:t>
+            </w:r>
+          </w:p>
+        </w:tc>
+      </w:tr>
+      <w:tr>
+        <w:tc>
+          <w:tcPr>
+            <w:tcW w:type="dxa" w:w="2800"/>
+            <w:tcBorders>
+              <w:top w:val="single" w:color="A6A6A6" w:sz="4"/>
+              <w:left w:val="single" w:color="A6A6A6" w:sz="4"/>
+              <w:bottom w:val="single" w:color="A6A6A6" w:sz="4"/>
+              <w:right w:val="single" w:color="A6A6A6" w:sz="4"/>
+            </w:tcBorders>
+            <w:tcMar>
+              <w:top w:type="dxa" w:w="60"/>
+              <w:left w:type="dxa" w:w="100"/>
+              <w:bottom w:type="dxa" w:w="60"/>
+              <w:right w:type="dxa" w:w="100"/>
+            </w:tcMar>
+          </w:tcPr>
+          <w:p>
+            <w:r>
               <w:rPr>
                 <w:b/>
                 <w:bCs/>
@@ -3133,7 +3295,7 @@
                 <w:b/>
                 <w:bCs/>
               </w:rPr>
-              <w:t xml:space="preserve">142</w:t>
+              <w:t xml:space="preserve">146</w:t>
             </w:r>
           </w:p>
         </w:tc>

</xml_diff>